<commit_message>
Deja Eva 1 lista para el equipo: plan híbrido, deck del oral y guía de estudio.
</commit_message>
<xml_diff>
--- a/evaluaciones/eva-01/informe/Alcance-EDT-y-exclusiones.docx
+++ b/evaluaciones/eva-01/informe/Alcance-EDT-y-exclusiones.docx
@@ -14,7 +14,7 @@
           <w:color w:val="10263D"/>
           <w:sz w:val="32"/>
         </w:rPr>
-        <w:t>Kiran — alcance cerrado, exclusiones y EDT</w:t>
+        <w:t>Kiran: alcance cerrado, exclusiones y EDT</w:t>
       </w:r>
     </w:p>
     <w:p>
@@ -37,6 +37,9 @@
         <w:spacing w:line="276" w:lineRule="auto" w:before="200" w:after="80"/>
         <w:ind w:firstLine="0"/>
         <w:jc w:val="left"/>
+        <w:pBdr>
+          <w:bottom w:val="single" w:sz="8" w:space="6" w:color="10263D"/>
+        </w:pBdr>
       </w:pPr>
       <w:r>
         <w:rPr>
@@ -46,7 +49,7 @@
           <w:color w:val="10263D"/>
           <w:sz w:val="26"/>
         </w:rPr>
-        <w:t>Qué es este proyecto (y qué no)</w:t>
+        <w:t>Qué es este proyecto y qué queda fuera</w:t>
       </w:r>
     </w:p>
     <w:p>
@@ -62,7 +65,7 @@
           <w:i w:val="0"/>
           <w:sz w:val="24"/>
         </w:rPr>
-        <w:t>Este documento cierra el alcance ANTES del Gantt. Si el árbol y las exclusiones no están firmados por el equipo, cualquier barra del cronograma es un deseo. Kiran es el proyecto de software de operación del piloto. No es un proyecto de ingeniería eléctrica.</w:t>
+        <w:t>Este documento cierra el alcance antes del Gantt. Si las exclusiones y la EDT no están firmadas por el equipo, cualquier barra del cronograma queda sin base. Kiran es el proyecto de software de operación del piloto. No es un proyecto de ingeniería eléctrica.</w:t>
       </w:r>
     </w:p>
     <w:p>
@@ -70,6 +73,9 @@
         <w:spacing w:line="276" w:lineRule="auto" w:before="200" w:after="80"/>
         <w:ind w:firstLine="0"/>
         <w:jc w:val="left"/>
+        <w:pBdr>
+          <w:bottom w:val="single" w:sz="8" w:space="6" w:color="10263D"/>
+        </w:pBdr>
       </w:pPr>
       <w:r>
         <w:rPr>
@@ -79,7 +85,7 @@
           <w:color w:val="10263D"/>
           <w:sz w:val="26"/>
         </w:rPr>
-        <w:t>Propuesta de valor (por qué este software, y no solo “otra planilla”)</w:t>
+        <w:t>Propuesta de valor (por qué este software y no solo otra planilla)</w:t>
       </w:r>
     </w:p>
     <w:p>
@@ -95,7 +101,7 @@
           <w:i w:val="0"/>
           <w:sz w:val="24"/>
         </w:rPr>
-        <w:t>Esta organización enfrenta falta de energía confiable, desarrollo económico limitado y dependencia de fósiles. Los kits solares son la solución física. Kiran no compite con el panel: mejora esa solución para que un kit instalado no se vuelva invisible. Valor = kits observables + fallas atendibles + reportes creíbles. Promesa: visibilidad que mantiene la energía activa. Si el técnico no usa el tablero, no hay valor aunque el código compile.</w:t>
+        <w:t>Esta organización enfrenta falta de energía confiable, desarrollo económico limitado y dependencia de fósiles. Los kits solares son la solución física. Kiran no compite con el panel: mejora esa solución para que un kit instalado no se vuelva invisible. Valor = kits observables + fallas atendibles + reportes creíbles. Promesa: visibilidad que mantiene la energía activa. Si el técnico no usa el tablero, no hay valor aunque el código esté listo.</w:t>
       </w:r>
     </w:p>
     <w:p>
@@ -111,7 +117,7 @@
           <w:i w:val="0"/>
           <w:sz w:val="24"/>
         </w:rPr>
-        <w:t>Mejoras sobre el brief de dirección, sin hinchar alcance: cadena kit→ticket→indicador; carga por lotes/offline; ticket como incidente de servicio; privacidad de hogares; indicadores honestos (activos, tiempo de resolución, bajas). Fuera: app ciudadana, sensores masivos, paneles.</w:t>
+        <w:t>Mejoras sobre el brief de dirección, sin hinchar alcance: cadena kit-ticket-indicador; carga por lotes u offline; ticket como incidente de servicio; privacidad de hogares; indicadores honestos (activos, tiempo de resolución, bajas). Fuera: app ciudadana, sensores masivos, paneles.</w:t>
       </w:r>
     </w:p>
     <w:p>
@@ -119,6 +125,9 @@
         <w:spacing w:line="276" w:lineRule="auto" w:before="200" w:after="80"/>
         <w:ind w:firstLine="0"/>
         <w:jc w:val="left"/>
+        <w:pBdr>
+          <w:bottom w:val="single" w:sz="8" w:space="6" w:color="10263D"/>
+        </w:pBdr>
       </w:pPr>
       <w:r>
         <w:rPr>
@@ -148,7 +157,7 @@
         <w:tc>
           <w:tcPr>
             <w:tcW w:type="dxa" w:w="2041"/>
-            <w:shd w:fill="1F4E79" w:val="clear"/>
+            <w:shd w:fill="10263D" w:val="clear"/>
           </w:tcPr>
           <w:p>
             <w:pPr>
@@ -170,7 +179,7 @@
         <w:tc>
           <w:tcPr>
             <w:tcW w:type="dxa" w:w="2721"/>
-            <w:shd w:fill="1F4E79" w:val="clear"/>
+            <w:shd w:fill="10263D" w:val="clear"/>
           </w:tcPr>
           <w:p>
             <w:pPr>
@@ -192,7 +201,7 @@
         <w:tc>
           <w:tcPr>
             <w:tcW w:type="dxa" w:w="4309"/>
-            <w:shd w:fill="1F4E79" w:val="clear"/>
+            <w:shd w:fill="10263D" w:val="clear"/>
           </w:tcPr>
           <w:p>
             <w:pPr>
@@ -477,6 +486,9 @@
         <w:spacing w:line="276" w:lineRule="auto" w:before="200" w:after="80"/>
         <w:ind w:firstLine="0"/>
         <w:jc w:val="left"/>
+        <w:pBdr>
+          <w:bottom w:val="single" w:sz="8" w:space="6" w:color="10263D"/>
+        </w:pBdr>
       </w:pPr>
       <w:r>
         <w:rPr>
@@ -505,7 +517,7 @@
         <w:tc>
           <w:tcPr>
             <w:tcW w:type="dxa" w:w="2268"/>
-            <w:shd w:fill="1F4E79" w:val="clear"/>
+            <w:shd w:fill="10263D" w:val="clear"/>
           </w:tcPr>
           <w:p>
             <w:pPr>
@@ -527,7 +539,7 @@
         <w:tc>
           <w:tcPr>
             <w:tcW w:type="dxa" w:w="6803"/>
-            <w:shd w:fill="1F4E79" w:val="clear"/>
+            <w:shd w:fill="10263D" w:val="clear"/>
           </w:tcPr>
           <w:p>
             <w:pPr>
@@ -670,7 +682,7 @@
                 <w:i w:val="0"/>
                 <w:sz w:val="18"/>
               </w:rPr>
-              <w:t>Módulos 2–5, roles/privacidad (6), capacitación (7), acta y plan preliminar, línea base en Project Libre.</w:t>
+              <w:t>Módulos 2 a 5, roles y privacidad (6), capacitación (7), acta y plan preliminar, línea base en Project Libre.</w:t>
             </w:r>
           </w:p>
         </w:tc>
@@ -816,6 +828,9 @@
         <w:spacing w:line="276" w:lineRule="auto" w:before="200" w:after="80"/>
         <w:ind w:firstLine="0"/>
         <w:jc w:val="left"/>
+        <w:pBdr>
+          <w:bottom w:val="single" w:sz="8" w:space="6" w:color="10263D"/>
+        </w:pBdr>
       </w:pPr>
       <w:r>
         <w:rPr>
@@ -845,7 +860,7 @@
         <w:tc>
           <w:tcPr>
             <w:tcW w:type="dxa" w:w="2494"/>
-            <w:shd w:fill="1F4E79" w:val="clear"/>
+            <w:shd w:fill="10263D" w:val="clear"/>
           </w:tcPr>
           <w:p>
             <w:pPr>
@@ -867,7 +882,7 @@
         <w:tc>
           <w:tcPr>
             <w:tcW w:type="dxa" w:w="3288"/>
-            <w:shd w:fill="1F4E79" w:val="clear"/>
+            <w:shd w:fill="10263D" w:val="clear"/>
           </w:tcPr>
           <w:p>
             <w:pPr>
@@ -889,7 +904,7 @@
         <w:tc>
           <w:tcPr>
             <w:tcW w:type="dxa" w:w="3288"/>
-            <w:shd w:fill="1F4E79" w:val="clear"/>
+            <w:shd w:fill="10263D" w:val="clear"/>
           </w:tcPr>
           <w:p>
             <w:pPr>
@@ -1309,7 +1324,7 @@
           <w:i w:val="0"/>
           <w:sz w:val="24"/>
         </w:rPr>
-        <w:t>Regla del equipo: si alguien pide “de paso un dashboard para toda India”, es un cambio. No se mete por el ladito al Gantt.</w:t>
+        <w:t>Regla del equipo: si alguien pide de paso un tablero para toda India, es un cambio. No se agrega al Gantt sin control de cambios.</w:t>
       </w:r>
     </w:p>
     <w:p>
@@ -1317,6 +1332,9 @@
         <w:spacing w:line="276" w:lineRule="auto" w:before="200" w:after="80"/>
         <w:ind w:firstLine="0"/>
         <w:jc w:val="left"/>
+        <w:pBdr>
+          <w:bottom w:val="single" w:sz="8" w:space="6" w:color="10263D"/>
+        </w:pBdr>
       </w:pPr>
       <w:r>
         <w:rPr>
@@ -1364,7 +1382,7 @@
         <w:tc>
           <w:tcPr>
             <w:tcW w:type="dxa" w:w="1134"/>
-            <w:shd w:fill="1F4E79" w:val="clear"/>
+            <w:shd w:fill="10263D" w:val="clear"/>
           </w:tcPr>
           <w:p>
             <w:pPr>
@@ -1386,7 +1404,7 @@
         <w:tc>
           <w:tcPr>
             <w:tcW w:type="dxa" w:w="4649"/>
-            <w:shd w:fill="1F4E79" w:val="clear"/>
+            <w:shd w:fill="10263D" w:val="clear"/>
           </w:tcPr>
           <w:p>
             <w:pPr>
@@ -1408,7 +1426,7 @@
         <w:tc>
           <w:tcPr>
             <w:tcW w:type="dxa" w:w="1928"/>
-            <w:shd w:fill="1F4E79" w:val="clear"/>
+            <w:shd w:fill="10263D" w:val="clear"/>
           </w:tcPr>
           <w:p>
             <w:pPr>
@@ -1430,7 +1448,7 @@
         <w:tc>
           <w:tcPr>
             <w:tcW w:type="dxa" w:w="1134"/>
-            <w:shd w:fill="1F4E79" w:val="clear"/>
+            <w:shd w:fill="10263D" w:val="clear"/>
           </w:tcPr>
           <w:p>
             <w:pPr>
@@ -1452,7 +1470,7 @@
         <w:tc>
           <w:tcPr>
             <w:tcW w:type="dxa" w:w="1361"/>
-            <w:shd w:fill="1F4E79" w:val="clear"/>
+            <w:shd w:fill="10263D" w:val="clear"/>
           </w:tcPr>
           <w:p>
             <w:pPr>
@@ -1549,7 +1567,7 @@
                 <w:i w:val="0"/>
                 <w:sz w:val="18"/>
               </w:rPr>
-              <w:t>—</w:t>
+              <w:t>-</w:t>
             </w:r>
           </w:p>
         </w:tc>
@@ -1569,7 +1587,7 @@
                 <w:i w:val="0"/>
                 <w:sz w:val="18"/>
               </w:rPr>
-              <w:t>—</w:t>
+              <w:t>-</w:t>
             </w:r>
           </w:p>
         </w:tc>
@@ -1967,7 +1985,7 @@
                 <w:i w:val="0"/>
                 <w:sz w:val="18"/>
               </w:rPr>
-              <w:t>—</w:t>
+              <w:t>-</w:t>
             </w:r>
           </w:p>
         </w:tc>
@@ -1987,7 +2005,7 @@
                 <w:i w:val="0"/>
                 <w:sz w:val="18"/>
               </w:rPr>
-              <w:t>—</w:t>
+              <w:t>-</w:t>
             </w:r>
           </w:p>
         </w:tc>
@@ -2491,7 +2509,7 @@
                 <w:i w:val="0"/>
                 <w:sz w:val="18"/>
               </w:rPr>
-              <w:t>—</w:t>
+              <w:t>-</w:t>
             </w:r>
           </w:p>
         </w:tc>
@@ -2512,7 +2530,7 @@
                 <w:i w:val="0"/>
                 <w:sz w:val="18"/>
               </w:rPr>
-              <w:t>—</w:t>
+              <w:t>-</w:t>
             </w:r>
           </w:p>
         </w:tc>
@@ -3012,7 +3030,7 @@
                 <w:i w:val="0"/>
                 <w:sz w:val="18"/>
               </w:rPr>
-              <w:t>—</w:t>
+              <w:t>-</w:t>
             </w:r>
           </w:p>
         </w:tc>
@@ -3032,7 +3050,7 @@
                 <w:i w:val="0"/>
                 <w:sz w:val="18"/>
               </w:rPr>
-              <w:t>—</w:t>
+              <w:t>-</w:t>
             </w:r>
           </w:p>
         </w:tc>
@@ -3536,7 +3554,7 @@
                 <w:i w:val="0"/>
                 <w:sz w:val="18"/>
               </w:rPr>
-              <w:t>—</w:t>
+              <w:t>-</w:t>
             </w:r>
           </w:p>
         </w:tc>
@@ -3557,7 +3575,7 @@
                 <w:i w:val="0"/>
                 <w:sz w:val="18"/>
               </w:rPr>
-              <w:t>—</w:t>
+              <w:t>-</w:t>
             </w:r>
           </w:p>
         </w:tc>
@@ -4057,7 +4075,7 @@
                 <w:i w:val="0"/>
                 <w:sz w:val="18"/>
               </w:rPr>
-              <w:t>—</w:t>
+              <w:t>-</w:t>
             </w:r>
           </w:p>
         </w:tc>
@@ -4077,7 +4095,7 @@
                 <w:i w:val="0"/>
                 <w:sz w:val="18"/>
               </w:rPr>
-              <w:t>—</w:t>
+              <w:t>-</w:t>
             </w:r>
           </w:p>
         </w:tc>
@@ -4581,7 +4599,7 @@
                 <w:i w:val="0"/>
                 <w:sz w:val="18"/>
               </w:rPr>
-              <w:t>—</w:t>
+              <w:t>-</w:t>
             </w:r>
           </w:p>
         </w:tc>
@@ -4602,7 +4620,7 @@
                 <w:i w:val="0"/>
                 <w:sz w:val="18"/>
               </w:rPr>
-              <w:t>—</w:t>
+              <w:t>-</w:t>
             </w:r>
           </w:p>
         </w:tc>
@@ -4946,6 +4964,9 @@
         <w:spacing w:line="276" w:lineRule="auto" w:before="200" w:after="80"/>
         <w:ind w:firstLine="0"/>
         <w:jc w:val="left"/>
+        <w:pBdr>
+          <w:bottom w:val="single" w:sz="8" w:space="6" w:color="10263D"/>
+        </w:pBdr>
       </w:pPr>
       <w:r>
         <w:rPr>
@@ -4955,7 +4976,7 @@
           <w:color w:val="10263D"/>
           <w:sz w:val="26"/>
         </w:rPr>
-        <w:t>Dependencia que amarra el árbol al calendario</w:t>
+        <w:t>Dependencia que amarra la EDT al calendario</w:t>
       </w:r>
     </w:p>
     <w:p>
@@ -4971,7 +4992,7 @@
           <w:i w:val="0"/>
           <w:sz w:val="24"/>
         </w:rPr>
-        <w:t>Inventario (2) alimenta tablero (3). Tablero individual (3.2) alimenta tickets (4.2). Tickets en terreno (4.4) alimentan el primer reporte (5.4). Privacidad y despliegue (6) corren en paralelo, pero 6.4 espera la carga 2.3. Capacitación (7) espera software usable. Esa lógica —no un plazo “que se nos ocurrió”— es la ruta crítica 1.1 → 2.1 → 2.2 → 2.3 → 3.1 → 3.2 → 4.2 → 4.3 → 4.4 → 5.4 → 7.3.</w:t>
+        <w:t>Inventario (2) alimenta tablero (3). Tablero individual (3.2) alimenta tickets (4.2). Tickets en terreno (4.4) alimentan el primer reporte (5.4). Privacidad y despliegue (6) corren en paralelo, pero 6.4 espera la carga 2.3. Capacitación (7) espera software usable. Esa lógica, y no un plazo inventado, es la ruta crítica 1.1, 2.1, 2.2, 2.3, 3.1, 3.2, 4.2, 4.3, 4.4, 5.4 y 7.3. Sprint 0 cubre el arranque de esa cadena (hasta 2.3). La holgura vive en privacidad (6.4: 23 días) e indicadores (5.2 y 5.3: 25 días). La reserva de tiempo está en PERT de 4.4 y en el 20 % no comprometido de cada sprint.</w:t>
       </w:r>
     </w:p>
     <w:sectPr>
@@ -5001,7 +5022,7 @@
         <w:color w:val="555555"/>
         <w:sz w:val="18"/>
       </w:rPr>
-      <w:t xml:space="preserve">Página </w:t>
+      <w:t xml:space="preserve">Kiran - </w:t>
     </w:r>
     <w:r>
       <w:rPr>
@@ -5034,7 +5055,7 @@
         <w:color w:val="555555"/>
         <w:sz w:val="18"/>
       </w:rPr>
-      <w:t>Kiran · Alcance cerrado, exclusiones y EDT · uso interno de dirección</w:t>
+      <w:t>Kiran - Alcance cerrado, exclusiones y EDT - uso interno de dirección</w:t>
     </w:r>
   </w:p>
 </w:hdr>

</xml_diff>